<commit_message>
reseccion de roles y permisos y apis
</commit_message>
<xml_diff>
--- a/docs/informes/Scene_Hub_Informe_Tecnico_2026-09-16.docx
+++ b/docs/informes/Scene_Hub_Informe_Tecnico_2026-09-16.docx
@@ -424,13 +424,9 @@
       </w:r>
     </w:p>
     <w:p>
-      <w:r>
-        <w:br w:type="page"/>
-      </w:r>
-    </w:p>
-    <w:p>
       <w:pPr>
         <w:pStyle w:val="Heading1"/>
+        <w:pageBreakBefore/>
       </w:pPr>
       <w:r>
         <w:t>1 Evolución del proyecto</w:t>
@@ -975,13 +971,9 @@
       </w:r>
     </w:p>
     <w:p>
-      <w:r>
-        <w:br w:type="page"/>
-      </w:r>
-    </w:p>
-    <w:p>
       <w:pPr>
         <w:pStyle w:val="Heading1"/>
+        <w:pageBreakBefore/>
       </w:pPr>
       <w:r>
         <w:t>2 Arquitectura de la solución</w:t>
@@ -1763,13 +1755,9 @@
       </w:r>
     </w:p>
     <w:p>
-      <w:r>
-        <w:br w:type="page"/>
-      </w:r>
-    </w:p>
-    <w:p>
       <w:pPr>
         <w:pStyle w:val="Heading1"/>
+        <w:pageBreakBefore/>
       </w:pPr>
       <w:r>
         <w:t>3 Modelo de datos y relaciones</w:t>
@@ -2692,13 +2680,9 @@
       </w:r>
     </w:p>
     <w:p>
-      <w:r>
-        <w:br w:type="page"/>
-      </w:r>
-    </w:p>
-    <w:p>
       <w:pPr>
         <w:pStyle w:val="Heading1"/>
+        <w:pageBreakBefore/>
       </w:pPr>
       <w:r>
         <w:t>4 Identidad y control de acceso</w:t>
@@ -3291,13 +3275,9 @@
       </w:r>
     </w:p>
     <w:p>
-      <w:r>
-        <w:br w:type="page"/>
-      </w:r>
-    </w:p>
-    <w:p>
       <w:pPr>
         <w:pStyle w:val="Heading1"/>
+        <w:pageBreakBefore/>
       </w:pPr>
       <w:r>
         <w:t>5 Gestión del ciclo de un escenario</w:t>
@@ -3390,13 +3370,9 @@
       </w:r>
     </w:p>
     <w:p>
-      <w:r>
-        <w:br w:type="page"/>
-      </w:r>
-    </w:p>
-    <w:p>
       <w:pPr>
         <w:pStyle w:val="Heading1"/>
+        <w:pageBreakBefore/>
       </w:pPr>
       <w:r>
         <w:t>6 Contrato de importación solar</w:t>
@@ -4555,13 +4531,9 @@
       </w:r>
     </w:p>
     <w:p>
-      <w:r>
-        <w:br w:type="page"/>
-      </w:r>
-    </w:p>
-    <w:p>
       <w:pPr>
         <w:pStyle w:val="Heading1"/>
+        <w:pageBreakBefore/>
       </w:pPr>
       <w:r>
         <w:t>7 Consulta y análisis de resultados solares</w:t>
@@ -5031,13 +5003,9 @@
       </w:r>
     </w:p>
     <w:p>
-      <w:r>
-        <w:br w:type="page"/>
-      </w:r>
-    </w:p>
-    <w:p>
       <w:pPr>
         <w:pStyle w:val="Heading1"/>
+        <w:pageBreakBefore/>
       </w:pPr>
       <w:r>
         <w:t>8 Publicación solar y consumo desde Unity</w:t>
@@ -5467,13 +5435,9 @@
       </w:r>
     </w:p>
     <w:p>
-      <w:r>
-        <w:br w:type="page"/>
-      </w:r>
-    </w:p>
-    <w:p>
       <w:pPr>
         <w:pStyle w:val="Heading1"/>
+        <w:pageBreakBefore/>
       </w:pPr>
       <w:r>
         <w:t>9 Gestión de datos emocionales por webinar</w:t>
@@ -5552,13 +5516,9 @@
       </w:r>
     </w:p>
     <w:p>
-      <w:r>
-        <w:br w:type="page"/>
-      </w:r>
-    </w:p>
-    <w:p>
       <w:pPr>
         <w:pStyle w:val="Heading1"/>
+        <w:pageBreakBefore/>
       </w:pPr>
       <w:r>
         <w:t>10 Formatos y validación emocional</w:t>
@@ -6406,26 +6366,14 @@
       </w:r>
     </w:p>
     <w:p>
-      <w:pPr>
-        <w:pStyle w:val="Heading2"/>
-      </w:pPr>
       <w:r>
-        <w:t>Trazabilidad del promedio</w:t>
-      </w:r>
-    </w:p>
-    <w:p>
-      <w:r>
-        <w:t>El campo archivo de la respuesta toma primero source_file del promedio y, si no existe, el del detalle. Cuando ambos fueron cargados desde libros distintos, esa propiedad única no representa los dos orígenes. La separación de formatos conserva los datos, pero la interfaz ofrece una referencia de archivo simplificada.</w:t>
-      </w:r>
-    </w:p>
-    <w:p>
-      <w:r>
-        <w:br w:type="page"/>
+        <w:t>La respuesta muestra como archivo primero source_file del promedio y, en su ausencia, el del detalle. Si ambos proceden de libros distintos, esa propiedad no expone simultáneamente los dos orígenes.</w:t>
       </w:r>
     </w:p>
     <w:p>
       <w:pPr>
         <w:pStyle w:val="Heading1"/>
+        <w:pageBreakBefore/>
       </w:pPr>
       <w:r>
         <w:t>11 Catálogo de la API pública</w:t>
@@ -6993,13 +6941,9 @@
       </w:r>
     </w:p>
     <w:p>
-      <w:r>
-        <w:br w:type="page"/>
-      </w:r>
-    </w:p>
-    <w:p>
       <w:pPr>
         <w:pStyle w:val="Heading1"/>
+        <w:pageBreakBefore/>
       </w:pPr>
       <w:r>
         <w:t>12 Operaciones internas del panel</w:t>
@@ -8217,13 +8161,9 @@
       </w:r>
     </w:p>
     <w:p>
-      <w:r>
-        <w:br w:type="page"/>
-      </w:r>
-    </w:p>
-    <w:p>
       <w:pPr>
         <w:pStyle w:val="Heading1"/>
+        <w:pageBreakBefore/>
       </w:pPr>
       <w:r>
         <w:t>13 Interfaz y comportamiento del panel</w:t>
@@ -8852,13 +8792,9 @@
       </w:r>
     </w:p>
     <w:p>
-      <w:r>
-        <w:br w:type="page"/>
-      </w:r>
-    </w:p>
-    <w:p>
       <w:pPr>
         <w:pStyle w:val="Heading1"/>
+        <w:pageBreakBefore/>
       </w:pPr>
       <w:r>
         <w:t>14 Despliegue y operación técnica</w:t>
@@ -8960,13 +8896,9 @@
       </w:r>
     </w:p>
     <w:p>
-      <w:r>
-        <w:br w:type="page"/>
-      </w:r>
-    </w:p>
-    <w:p>
       <w:pPr>
         <w:pStyle w:val="Heading1"/>
+        <w:pageBreakBefore/>
       </w:pPr>
       <w:r>
         <w:t>15 Verificación técnica al corte</w:t>
@@ -9288,13 +9220,9 @@
       </w:r>
     </w:p>
     <w:p>
-      <w:r>
-        <w:br w:type="page"/>
-      </w:r>
-    </w:p>
-    <w:p>
       <w:pPr>
         <w:pStyle w:val="Heading1"/>
+        <w:pageBreakBefore/>
       </w:pPr>
       <w:r>
         <w:t>16 Hallazgos y prioridades de consolidación</w:t>
@@ -10276,13 +10204,9 @@
       </w:r>
     </w:p>
     <w:p>
-      <w:r>
-        <w:br w:type="page"/>
-      </w:r>
-    </w:p>
-    <w:p>
       <w:pPr>
         <w:pStyle w:val="Heading1"/>
+        <w:pageBreakBefore/>
       </w:pPr>
       <w:r>
         <w:t>17 Fuentes técnicas y criterios de cierre</w:t>

</xml_diff>